<commit_message>
ISIN saugykla įjungta: dashboard redagavimas, pradinis sąrašas, svetainės perstatymas po sinchronizavimo
Co-Authored-By: Claude Opus 5.5 (1M context) <noreply@anthropic.com>
Claude-Session: https://claude.ai/code/session_013ZCssjCF43KM8LCnCdqfwt
</commit_message>
<xml_diff>
--- a/docs/files/luminor/luminor_1H2026_lt.docx
+++ b/docs/files/luminor/luminor_1H2026_lt.docx
@@ -4921,7 +4921,7 @@
           <w:color w:val="333333"/>
           <w:sz w:val="19"/>
         </w:rPr>
-        <w:t>Bendravardis sąrašuose: luminor oy.</w:t>
+        <w:t>Bendravardis sąrašuose: Luminor Oy – Suomijos logistikos įmonė, susijusi su Siberica Oy (pagal ES sąrašo įrašą apie Gabriel Temin), ne Luminor Bank AS.</w:t>
       </w:r>
     </w:p>
     <w:p>
@@ -4941,7 +4941,7 @@
           <w:color w:val="333333"/>
           <w:sz w:val="19"/>
         </w:rPr>
-        <w:t>Bendravardis sąrašuose: Luminor Oy – Suomijos logistikos įmonė, susijusi su Siberica Oy (pagal ES sąrašo įrašą apie Gabriel Temin), ne Luminor Bank AS.</w:t>
+        <w:t>Bendravardis sąrašuose: Luminor Logistics – slapyvardis tame pačiame US OFAC įrašų rinkinyje kaip Luminor Oy ir Siberica Oy (logistika), ne Luminor Bank AS.</w:t>
       </w:r>
     </w:p>
     <w:p>

</xml_diff>